<commit_message>
update: church service schedule
</commit_message>
<xml_diff>
--- a/src/assets/webassets/Details.docx
+++ b/src/assets/webassets/Details.docx
@@ -67,10 +67,16 @@
         <w:pStyle w:val="Normal"/>
         <w:bidi w:val="0"/>
         <w:jc w:val="left"/>
-        <w:rPr/>
-      </w:pPr>
-      <w:r>
-        <w:rPr/>
+        <w:rPr>
+          <w:b/>
+          <w:bCs/>
+        </w:rPr>
+      </w:pPr>
+      <w:r>
+        <w:rPr>
+          <w:b/>
+          <w:bCs/>
+        </w:rPr>
         <w:t xml:space="preserve">Njia ya kutuma sadaka ni; </w:t>
       </w:r>
     </w:p>
@@ -79,10 +85,16 @@
         <w:pStyle w:val="Normal"/>
         <w:bidi w:val="0"/>
         <w:jc w:val="left"/>
-        <w:rPr/>
-      </w:pPr>
-      <w:r>
-        <w:rPr/>
+        <w:rPr>
+          <w:b/>
+          <w:bCs/>
+        </w:rPr>
+      </w:pPr>
+      <w:r>
+        <w:rPr>
+          <w:b/>
+          <w:bCs/>
+        </w:rPr>
         <w:t>Paybill; 222111</w:t>
       </w:r>
     </w:p>
@@ -91,10 +103,16 @@
         <w:pStyle w:val="Normal"/>
         <w:bidi w:val="0"/>
         <w:jc w:val="left"/>
-        <w:rPr/>
-      </w:pPr>
-      <w:r>
-        <w:rPr/>
+        <w:rPr>
+          <w:b/>
+          <w:bCs/>
+        </w:rPr>
+      </w:pPr>
+      <w:r>
+        <w:rPr>
+          <w:b/>
+          <w:bCs/>
+        </w:rPr>
         <w:t>Account; 081000022814</w:t>
       </w:r>
     </w:p>
@@ -103,10 +121,16 @@
         <w:pStyle w:val="Normal"/>
         <w:bidi w:val="0"/>
         <w:jc w:val="left"/>
-        <w:rPr/>
-      </w:pPr>
-      <w:r>
-        <w:rPr/>
+        <w:rPr>
+          <w:b/>
+          <w:bCs/>
+        </w:rPr>
+      </w:pPr>
+      <w:r>
+        <w:rPr>
+          <w:b/>
+          <w:bCs/>
+        </w:rPr>
         <w:t>Mpesa; 0723130292</w:t>
       </w:r>
     </w:p>
@@ -192,10 +216,16 @@
         <w:pStyle w:val="Normal"/>
         <w:bidi w:val="0"/>
         <w:jc w:val="left"/>
-        <w:rPr/>
-      </w:pPr>
-      <w:r>
-        <w:rPr/>
+        <w:rPr>
+          <w:b/>
+          <w:bCs/>
+        </w:rPr>
+      </w:pPr>
+      <w:r>
+        <w:rPr>
+          <w:b/>
+          <w:bCs/>
+        </w:rPr>
         <w:t>Then our services are as follows;</w:t>
       </w:r>
     </w:p>
@@ -204,10 +234,16 @@
         <w:pStyle w:val="Normal"/>
         <w:bidi w:val="0"/>
         <w:jc w:val="left"/>
-        <w:rPr/>
-      </w:pPr>
-      <w:r>
-        <w:rPr/>
+        <w:rPr>
+          <w:b/>
+          <w:bCs/>
+        </w:rPr>
+      </w:pPr>
+      <w:r>
+        <w:rPr>
+          <w:b/>
+          <w:bCs/>
+        </w:rPr>
         <w:t>Sunday 9:00AM-1:00PM</w:t>
       </w:r>
     </w:p>
@@ -216,10 +252,16 @@
         <w:pStyle w:val="Normal"/>
         <w:bidi w:val="0"/>
         <w:jc w:val="left"/>
-        <w:rPr/>
-      </w:pPr>
-      <w:r>
-        <w:rPr/>
+        <w:rPr>
+          <w:b/>
+          <w:bCs/>
+        </w:rPr>
+      </w:pPr>
+      <w:r>
+        <w:rPr>
+          <w:b/>
+          <w:bCs/>
+        </w:rPr>
         <w:t>Friday 10:00AM-12:00PM</w:t>
       </w:r>
     </w:p>
@@ -228,10 +270,16 @@
         <w:pStyle w:val="Normal"/>
         <w:bidi w:val="0"/>
         <w:jc w:val="left"/>
-        <w:rPr/>
-      </w:pPr>
-      <w:r>
-        <w:rPr/>
+        <w:rPr>
+          <w:b/>
+          <w:bCs/>
+        </w:rPr>
+      </w:pPr>
+      <w:r>
+        <w:rPr>
+          <w:b/>
+          <w:bCs/>
+        </w:rPr>
         <w:t>Wednesday 10:00AM-11:AM</w:t>
       </w:r>
     </w:p>
@@ -454,6 +502,7 @@
       <w:pgNumType w:fmt="decimal"/>
       <w:formProt w:val="false"/>
       <w:textDirection w:val="lrTb"/>
+      <w:docGrid w:type="default" w:linePitch="100" w:charSpace="0"/>
     </w:sectPr>
   </w:body>
 </w:document>
@@ -473,7 +522,6 @@
     </w:rPrDefault>
     <w:pPrDefault>
       <w:pPr>
-        <w:widowControl/>
         <w:suppressAutoHyphens w:val="true"/>
       </w:pPr>
     </w:pPrDefault>
@@ -483,7 +531,10 @@
     <w:qFormat/>
     <w:pPr>
       <w:widowControl/>
+      <w:suppressAutoHyphens w:val="true"/>
       <w:bidi w:val="0"/>
+      <w:spacing w:before="0" w:after="0"/>
+      <w:jc w:val="left"/>
     </w:pPr>
     <w:rPr>
       <w:rFonts w:ascii="Liberation Serif" w:hAnsi="Liberation Serif" w:eastAsia="Noto Serif CJK SC" w:cs="FreeSans"/>

</xml_diff>

<commit_message>
add: communtiy outreach section
</commit_message>
<xml_diff>
--- a/src/assets/webassets/Details.docx
+++ b/src/assets/webassets/Details.docx
@@ -153,13 +153,18 @@
         <w:rPr/>
       </w:pPr>
       <w:r>
-        <w:rPr/>
+        <w:rPr>
+          <w:b/>
+          <w:bCs/>
+        </w:rPr>
         <w:t xml:space="preserve">Email; </w:t>
       </w:r>
       <w:hyperlink r:id="rId2">
         <w:r>
           <w:rPr>
             <w:rStyle w:val="Hyperlink"/>
+            <w:b/>
+            <w:bCs/>
           </w:rPr>
           <w:t>newcovenantchurchalphaandomega@gmail.com</w:t>
         </w:r>

</xml_diff>